<commit_message>
Update author affiliation and contributions in underwater reconstruction comparison manuscript; revise figure legends and underwater reconstruction comparison documents.
</commit_message>
<xml_diff>
--- a/figure_legends.docx
+++ b/figure_legends.docx
@@ -148,8 +148,10 @@
     </w:p>
     <w:bookmarkEnd w:id="9"/>
     <w:sectPr>
-      <w:pgSz w:h="15840" w:w="12240"/>
       <w:pgMar w:top="720" w:right="1440" w:bottom="720" w:left="1440" w:header="720" w:footer="720" w:gutter="0"/>
+      <w:footnotePr>
+        <w:numRestart w:val="eachSect"/>
+      </w:footnotePr>
     </w:sectPr>
   </w:body>
 </w:document>
@@ -263,11 +265,11 @@
 </file>
 
 <file path=word/styles.xml><?xml version="1.0" encoding="utf-8"?>
-<w:styles xmlns:w="http://schemas.openxmlformats.org/wordprocessingml/2006/main">
+<w:styles xmlns:r="http://schemas.openxmlformats.org/officeDocument/2006/relationships" xmlns:w="http://schemas.openxmlformats.org/wordprocessingml/2006/main">
   <w:docDefaults>
     <w:rPrDefault>
       <w:rPr>
-        <w:rFonts w:asciiTheme="minorHAnsi" w:cstheme="minorBidi" w:eastAsiaTheme="minorEastAsia" w:hAnsiTheme="minorHAnsi"/>
+        <w:rFonts w:ascii="Times New Roman" w:hAnsi="Times New Roman" w:cs="Times New Roman" w:eastAsia="Times New Roman"/>
         <w:sz w:val="24"/>
         <w:szCs w:val="24"/>
         <w:lang w:bidi="ar-SA" w:eastAsia="zh-CN" w:val="en-US"/>
@@ -275,7 +277,8 @@
     </w:rPrDefault>
     <w:pPrDefault>
       <w:pPr>
-        <w:spacing w:after="200"/>
+        <w:spacing w:before="0" w:after="276" w:line="276" w:lineRule="auto"/>
+        <w:ind w:firstLine="0"/>
       </w:pPr>
     </w:pPrDefault>
   </w:docDefaults>
@@ -289,7 +292,8 @@
       <w:szCs w:val="24"/>
     </w:rPr>
     <w:pPr>
-      <w:spacing w:line="276" w:lineRule="auto" w:after="276" w:before="0"/>
+      <w:spacing w:before="0" w:after="276" w:line="276" w:lineRule="auto"/>
+      <w:ind w:firstLine="0"/>
     </w:pPr>
   </w:style>
   <w:style w:styleId="BodyText" w:type="paragraph">
@@ -298,7 +302,8 @@
     <w:link w:val="BodyTextChar"/>
     <w:qFormat/>
     <w:pPr>
-      <w:spacing w:after="276" w:before="0" w:line="276" w:lineRule="auto"/>
+      <w:spacing w:before="0" w:after="276" w:line="276" w:lineRule="auto"/>
+      <w:ind w:firstLine="0"/>
     </w:pPr>
     <w:rPr>
       <w:rFonts w:ascii="Times New Roman" w:hAnsi="Times New Roman" w:cs="Times New Roman" w:eastAsia="Times New Roman"/>
@@ -317,7 +322,8 @@
       <w:szCs w:val="24"/>
     </w:rPr>
     <w:pPr>
-      <w:spacing w:line="276" w:lineRule="auto" w:after="276" w:before="0"/>
+      <w:spacing w:before="0" w:after="276" w:line="276" w:lineRule="auto"/>
+      <w:ind w:firstLine="0"/>
     </w:pPr>
   </w:style>
   <w:style w:customStyle="1" w:styleId="Compact" w:type="paragraph">
@@ -325,8 +331,14 @@
     <w:basedOn w:val="BodyText"/>
     <w:qFormat/>
     <w:pPr>
-      <w:spacing w:after="36" w:before="36"/>
-    </w:pPr>
+      <w:spacing w:before="0" w:after="276" w:line="276" w:lineRule="auto"/>
+      <w:ind w:firstLine="0"/>
+    </w:pPr>
+    <w:rPr>
+      <w:rFonts w:ascii="Times New Roman" w:hAnsi="Times New Roman" w:cs="Times New Roman" w:eastAsia="Times New Roman"/>
+      <w:sz w:val="24"/>
+      <w:szCs w:val="24"/>
+    </w:rPr>
   </w:style>
   <w:style w:styleId="Title" w:type="paragraph">
     <w:name w:val="Title"/>
@@ -337,14 +349,15 @@
     <w:qFormat/>
     <w:rsid w:val="00A10FD9"/>
     <w:pPr>
-      <w:spacing w:after="80" w:line="240" w:lineRule="auto"/>
+      <w:spacing w:before="0" w:after="276" w:line="276" w:lineRule="auto"/>
       <w:contextualSpacing/>
       <w:jc w:val="center"/>
-    </w:pPr>
-    <w:rPr>
-      <w:rFonts w:asciiTheme="majorHAnsi" w:cstheme="majorBidi" w:eastAsiaTheme="majorEastAsia" w:hAnsiTheme="majorHAnsi"/>
-      <w:sz w:val="56"/>
-      <w:szCs w:val="56"/>
+      <w:ind w:firstLine="0"/>
+    </w:pPr>
+    <w:rPr>
+      <w:rFonts w:ascii="Times New Roman" w:hAnsi="Times New Roman" w:cs="Times New Roman" w:eastAsia="Times New Roman"/>
+      <w:sz w:val="24"/>
+      <w:szCs w:val="24"/>
     </w:rPr>
   </w:style>
   <w:style w:customStyle="1" w:styleId="TitleChar" w:type="character">
@@ -371,12 +384,13 @@
       <w:numPr>
         <w:ilvl w:val="1"/>
       </w:numPr>
-    </w:pPr>
-    <w:rPr>
-      <w:rFonts w:cstheme="majorBidi" w:eastAsiaTheme="majorEastAsia"/>
-      <w:spacing w:val="15"/>
-      <w:sz w:val="28"/>
-      <w:szCs w:val="28"/>
+      <w:ind w:firstLine="0"/>
+    </w:pPr>
+    <w:rPr>
+      <w:rFonts w:ascii="Times New Roman" w:hAnsi="Times New Roman" w:cs="Times New Roman" w:eastAsia="Times New Roman"/>
+      <w:spacing w:before="0" w:after="276" w:line="276" w:lineRule="auto"/>
+      <w:sz w:val="24"/>
+      <w:szCs w:val="24"/>
     </w:rPr>
   </w:style>
   <w:style w:customStyle="1" w:styleId="SubtitleChar" w:type="character">
@@ -472,11 +486,12 @@
     <w:pPr>
       <w:keepNext/>
       <w:keepLines/>
-      <w:spacing w:after="276" w:before="0" w:line="276" w:lineRule="auto"/>
+      <w:spacing w:before="0" w:after="276" w:line="276" w:lineRule="auto"/>
       <w:outlineLvl w:val="0"/>
-    </w:pPr>
-    <w:rPr>
-      <w:rFonts w:asciiTheme="majorHAnsi" w:cstheme="majorBidi" w:eastAsiaTheme="majorEastAsia" w:hAnsiTheme="majorHAnsi" w:ascii="Times New Roman" w:hAnsi="Times New Roman" w:cs="Times New Roman" w:eastAsia="Times New Roman"/>
+      <w:ind w:firstLine="0"/>
+    </w:pPr>
+    <w:rPr>
+      <w:rFonts w:ascii="Times New Roman" w:hAnsi="Times New Roman" w:cs="Times New Roman" w:eastAsia="Times New Roman"/>
       <w:color w:themeColor="accent1" w:themeShade="BF" w:val="0F4761"/>
       <w:sz w:val="24"/>
       <w:szCs w:val="24"/>
@@ -495,11 +510,12 @@
     <w:pPr>
       <w:keepNext/>
       <w:keepLines/>
-      <w:spacing w:after="276" w:before="0" w:line="276" w:lineRule="auto"/>
+      <w:spacing w:before="0" w:after="276" w:line="276" w:lineRule="auto"/>
       <w:outlineLvl w:val="1"/>
-    </w:pPr>
-    <w:rPr>
-      <w:rFonts w:asciiTheme="majorHAnsi" w:cstheme="majorBidi" w:eastAsiaTheme="majorEastAsia" w:hAnsiTheme="majorHAnsi" w:ascii="Times New Roman" w:hAnsi="Times New Roman" w:cs="Times New Roman" w:eastAsia="Times New Roman"/>
+      <w:ind w:firstLine="0"/>
+    </w:pPr>
+    <w:rPr>
+      <w:rFonts w:ascii="Times New Roman" w:hAnsi="Times New Roman" w:cs="Times New Roman" w:eastAsia="Times New Roman"/>
       <w:color w:themeColor="accent1" w:themeShade="BF" w:val="0F4761"/>
       <w:sz w:val="24"/>
       <w:szCs w:val="24"/>
@@ -518,9 +534,186 @@
     <w:pPr>
       <w:keepNext/>
       <w:keepLines/>
-      <w:spacing w:after="80" w:before="160"/>
+      <w:spacing w:before="0" w:after="276" w:line="276" w:lineRule="auto"/>
       <w:outlineLvl w:val="2"/>
-    </w:pPr>
+      <w:ind w:firstLine="0"/>
+    </w:pPr>
+    <w:rPr>
+      <w:rFonts w:ascii="Times New Roman" w:hAnsi="Times New Roman" w:cs="Times New Roman" w:eastAsia="Times New Roman"/>
+      <w:color w:themeColor="accent1" w:themeShade="BF" w:val="0F4761"/>
+      <w:sz w:val="24"/>
+      <w:szCs w:val="24"/>
+    </w:rPr>
+  </w:style>
+  <w:style w:styleId="Heading4" w:type="paragraph">
+    <w:name w:val="heading 4"/>
+    <w:basedOn w:val="Normal"/>
+    <w:next w:val="BodyText"/>
+    <w:link w:val="Heading4Char"/>
+    <w:uiPriority w:val="9"/>
+    <w:semiHidden/>
+    <w:unhideWhenUsed/>
+    <w:qFormat/>
+    <w:rsid w:val="00A10FD9"/>
+    <w:pPr>
+      <w:keepNext/>
+      <w:keepLines/>
+      <w:spacing w:before="0" w:after="276" w:line="276" w:lineRule="auto"/>
+      <w:outlineLvl w:val="3"/>
+      <w:ind w:firstLine="0"/>
+    </w:pPr>
+    <w:rPr>
+      <w:sz w:val="24"/>
+      <w:rFonts w:ascii="Times New Roman" w:hAnsi="Times New Roman" w:cs="Times New Roman" w:eastAsia="Times New Roman"/>
+      <w:i/>
+      <w:iCs/>
+      <w:color w:themeColor="accent1" w:themeShade="BF" w:val="0F4761"/>
+      <w:szCs w:val="24"/>
+    </w:rPr>
+  </w:style>
+  <w:style w:styleId="Heading5" w:type="paragraph">
+    <w:name w:val="heading 5"/>
+    <w:basedOn w:val="Normal"/>
+    <w:next w:val="BodyText"/>
+    <w:link w:val="Heading5Char"/>
+    <w:uiPriority w:val="9"/>
+    <w:semiHidden/>
+    <w:unhideWhenUsed/>
+    <w:qFormat/>
+    <w:rsid w:val="00A10FD9"/>
+    <w:pPr>
+      <w:keepNext/>
+      <w:keepLines/>
+      <w:spacing w:after="40" w:before="80"/>
+      <w:outlineLvl w:val="4"/>
+    </w:pPr>
+    <w:rPr>
+      <w:rFonts w:cstheme="majorBidi" w:eastAsiaTheme="majorEastAsia"/>
+      <w:color w:themeColor="accent1" w:themeShade="BF" w:val="0F4761"/>
+    </w:rPr>
+  </w:style>
+  <w:style w:styleId="Heading6" w:type="paragraph">
+    <w:name w:val="heading 6"/>
+    <w:basedOn w:val="Normal"/>
+    <w:next w:val="BodyText"/>
+    <w:link w:val="Heading6Char"/>
+    <w:uiPriority w:val="9"/>
+    <w:semiHidden/>
+    <w:unhideWhenUsed/>
+    <w:qFormat/>
+    <w:rsid w:val="00A10FD9"/>
+    <w:pPr>
+      <w:keepNext/>
+      <w:keepLines/>
+      <w:spacing w:after="0" w:before="40"/>
+      <w:outlineLvl w:val="5"/>
+    </w:pPr>
+    <w:rPr>
+      <w:rFonts w:cstheme="majorBidi" w:eastAsiaTheme="majorEastAsia"/>
+      <w:i/>
+      <w:iCs/>
+      <w:color w:themeColor="text1" w:themeTint="A6" w:val="595959"/>
+    </w:rPr>
+  </w:style>
+  <w:style w:styleId="Heading7" w:type="paragraph">
+    <w:name w:val="heading 7"/>
+    <w:basedOn w:val="Normal"/>
+    <w:next w:val="BodyText"/>
+    <w:link w:val="Heading7Char"/>
+    <w:uiPriority w:val="9"/>
+    <w:semiHidden/>
+    <w:unhideWhenUsed/>
+    <w:qFormat/>
+    <w:rsid w:val="00A10FD9"/>
+    <w:pPr>
+      <w:keepNext/>
+      <w:keepLines/>
+      <w:spacing w:after="0" w:before="40"/>
+      <w:outlineLvl w:val="6"/>
+    </w:pPr>
+    <w:rPr>
+      <w:rFonts w:cstheme="majorBidi" w:eastAsiaTheme="majorEastAsia"/>
+      <w:color w:themeColor="text1" w:themeTint="A6" w:val="595959"/>
+    </w:rPr>
+  </w:style>
+  <w:style w:styleId="Heading8" w:type="paragraph">
+    <w:name w:val="heading 8"/>
+    <w:basedOn w:val="Normal"/>
+    <w:next w:val="BodyText"/>
+    <w:link w:val="Heading8Char"/>
+    <w:uiPriority w:val="9"/>
+    <w:semiHidden/>
+    <w:unhideWhenUsed/>
+    <w:qFormat/>
+    <w:rsid w:val="00A10FD9"/>
+    <w:pPr>
+      <w:keepNext/>
+      <w:keepLines/>
+      <w:spacing w:after="0"/>
+      <w:outlineLvl w:val="7"/>
+    </w:pPr>
+    <w:rPr>
+      <w:rFonts w:cstheme="majorBidi" w:eastAsiaTheme="majorEastAsia"/>
+      <w:i/>
+      <w:iCs/>
+      <w:color w:themeColor="text1" w:themeTint="D8" w:val="272727"/>
+    </w:rPr>
+  </w:style>
+  <w:style w:styleId="Heading9" w:type="paragraph">
+    <w:name w:val="heading 9"/>
+    <w:basedOn w:val="Normal"/>
+    <w:next w:val="BodyText"/>
+    <w:link w:val="Heading9Char"/>
+    <w:uiPriority w:val="9"/>
+    <w:semiHidden/>
+    <w:unhideWhenUsed/>
+    <w:qFormat/>
+    <w:rsid w:val="00A10FD9"/>
+    <w:pPr>
+      <w:keepNext/>
+      <w:keepLines/>
+      <w:spacing w:after="0"/>
+      <w:outlineLvl w:val="8"/>
+    </w:pPr>
+    <w:rPr>
+      <w:rFonts w:cstheme="majorBidi" w:eastAsiaTheme="majorEastAsia"/>
+      <w:color w:themeColor="text1" w:themeTint="D8" w:val="272727"/>
+    </w:rPr>
+  </w:style>
+  <w:style w:customStyle="1" w:styleId="Heading1Char" w:type="character">
+    <w:name w:val="Heading 1 Char"/>
+    <w:basedOn w:val="DefaultParagraphFont"/>
+    <w:link w:val="Heading1"/>
+    <w:uiPriority w:val="9"/>
+    <w:rsid w:val="00A10FD9"/>
+    <w:rPr>
+      <w:rFonts w:asciiTheme="majorHAnsi" w:cstheme="majorBidi" w:eastAsiaTheme="majorEastAsia" w:hAnsiTheme="majorHAnsi"/>
+      <w:color w:themeColor="accent1" w:themeShade="BF" w:val="0F4761"/>
+      <w:sz w:val="40"/>
+      <w:szCs w:val="40"/>
+    </w:rPr>
+  </w:style>
+  <w:style w:customStyle="1" w:styleId="Heading2Char" w:type="character">
+    <w:name w:val="Heading 2 Char"/>
+    <w:basedOn w:val="DefaultParagraphFont"/>
+    <w:link w:val="Heading2"/>
+    <w:uiPriority w:val="9"/>
+    <w:semiHidden/>
+    <w:rsid w:val="00A10FD9"/>
+    <w:rPr>
+      <w:rFonts w:asciiTheme="majorHAnsi" w:cstheme="majorBidi" w:eastAsiaTheme="majorEastAsia" w:hAnsiTheme="majorHAnsi"/>
+      <w:color w:themeColor="accent1" w:themeShade="BF" w:val="0F4761"/>
+      <w:sz w:val="32"/>
+      <w:szCs w:val="32"/>
+    </w:rPr>
+  </w:style>
+  <w:style w:customStyle="1" w:styleId="Heading3Char" w:type="character">
+    <w:name w:val="Heading 3 Char"/>
+    <w:basedOn w:val="DefaultParagraphFont"/>
+    <w:link w:val="Heading3"/>
+    <w:uiPriority w:val="9"/>
+    <w:semiHidden/>
+    <w:rsid w:val="00A10FD9"/>
     <w:rPr>
       <w:rFonts w:cstheme="majorBidi" w:eastAsiaTheme="majorEastAsia"/>
       <w:color w:themeColor="accent1" w:themeShade="BF" w:val="0F4761"/>
@@ -528,22 +721,13 @@
       <w:szCs w:val="28"/>
     </w:rPr>
   </w:style>
-  <w:style w:styleId="Heading4" w:type="paragraph">
-    <w:name w:val="heading 4"/>
-    <w:basedOn w:val="Normal"/>
-    <w:next w:val="BodyText"/>
-    <w:link w:val="Heading4Char"/>
-    <w:uiPriority w:val="9"/>
-    <w:semiHidden/>
-    <w:unhideWhenUsed/>
-    <w:qFormat/>
-    <w:rsid w:val="00A10FD9"/>
-    <w:pPr>
-      <w:keepNext/>
-      <w:keepLines/>
-      <w:spacing w:after="40" w:before="80"/>
-      <w:outlineLvl w:val="3"/>
-    </w:pPr>
+  <w:style w:customStyle="1" w:styleId="Heading4Char" w:type="character">
+    <w:name w:val="Heading 4 Char"/>
+    <w:basedOn w:val="DefaultParagraphFont"/>
+    <w:link w:val="Heading4"/>
+    <w:uiPriority w:val="9"/>
+    <w:semiHidden/>
+    <w:rsid w:val="00A10FD9"/>
     <w:rPr>
       <w:rFonts w:cstheme="majorBidi" w:eastAsiaTheme="majorEastAsia"/>
       <w:i/>
@@ -551,43 +735,25 @@
       <w:color w:themeColor="accent1" w:themeShade="BF" w:val="0F4761"/>
     </w:rPr>
   </w:style>
-  <w:style w:styleId="Heading5" w:type="paragraph">
-    <w:name w:val="heading 5"/>
-    <w:basedOn w:val="Normal"/>
-    <w:next w:val="BodyText"/>
-    <w:link w:val="Heading5Char"/>
-    <w:uiPriority w:val="9"/>
-    <w:semiHidden/>
-    <w:unhideWhenUsed/>
-    <w:qFormat/>
-    <w:rsid w:val="00A10FD9"/>
-    <w:pPr>
-      <w:keepNext/>
-      <w:keepLines/>
-      <w:spacing w:after="40" w:before="80"/>
-      <w:outlineLvl w:val="4"/>
-    </w:pPr>
+  <w:style w:customStyle="1" w:styleId="Heading5Char" w:type="character">
+    <w:name w:val="Heading 5 Char"/>
+    <w:basedOn w:val="DefaultParagraphFont"/>
+    <w:link w:val="Heading5"/>
+    <w:uiPriority w:val="9"/>
+    <w:semiHidden/>
+    <w:rsid w:val="00A10FD9"/>
     <w:rPr>
       <w:rFonts w:cstheme="majorBidi" w:eastAsiaTheme="majorEastAsia"/>
       <w:color w:themeColor="accent1" w:themeShade="BF" w:val="0F4761"/>
     </w:rPr>
   </w:style>
-  <w:style w:styleId="Heading6" w:type="paragraph">
-    <w:name w:val="heading 6"/>
-    <w:basedOn w:val="Normal"/>
-    <w:next w:val="BodyText"/>
-    <w:link w:val="Heading6Char"/>
-    <w:uiPriority w:val="9"/>
-    <w:semiHidden/>
-    <w:unhideWhenUsed/>
-    <w:qFormat/>
-    <w:rsid w:val="00A10FD9"/>
-    <w:pPr>
-      <w:keepNext/>
-      <w:keepLines/>
-      <w:spacing w:after="0" w:before="40"/>
-      <w:outlineLvl w:val="5"/>
-    </w:pPr>
+  <w:style w:customStyle="1" w:styleId="Heading6Char" w:type="character">
+    <w:name w:val="Heading 6 Char"/>
+    <w:basedOn w:val="DefaultParagraphFont"/>
+    <w:link w:val="Heading6"/>
+    <w:uiPriority w:val="9"/>
+    <w:semiHidden/>
+    <w:rsid w:val="00A10FD9"/>
     <w:rPr>
       <w:rFonts w:cstheme="majorBidi" w:eastAsiaTheme="majorEastAsia"/>
       <w:i/>
@@ -595,43 +761,25 @@
       <w:color w:themeColor="text1" w:themeTint="A6" w:val="595959"/>
     </w:rPr>
   </w:style>
-  <w:style w:styleId="Heading7" w:type="paragraph">
-    <w:name w:val="heading 7"/>
-    <w:basedOn w:val="Normal"/>
-    <w:next w:val="BodyText"/>
-    <w:link w:val="Heading7Char"/>
-    <w:uiPriority w:val="9"/>
-    <w:semiHidden/>
-    <w:unhideWhenUsed/>
-    <w:qFormat/>
-    <w:rsid w:val="00A10FD9"/>
-    <w:pPr>
-      <w:keepNext/>
-      <w:keepLines/>
-      <w:spacing w:after="0" w:before="40"/>
-      <w:outlineLvl w:val="6"/>
-    </w:pPr>
+  <w:style w:customStyle="1" w:styleId="Heading7Char" w:type="character">
+    <w:name w:val="Heading 7 Char"/>
+    <w:basedOn w:val="DefaultParagraphFont"/>
+    <w:link w:val="Heading7"/>
+    <w:uiPriority w:val="9"/>
+    <w:semiHidden/>
+    <w:rsid w:val="00A10FD9"/>
     <w:rPr>
       <w:rFonts w:cstheme="majorBidi" w:eastAsiaTheme="majorEastAsia"/>
       <w:color w:themeColor="text1" w:themeTint="A6" w:val="595959"/>
     </w:rPr>
   </w:style>
-  <w:style w:styleId="Heading8" w:type="paragraph">
-    <w:name w:val="heading 8"/>
-    <w:basedOn w:val="Normal"/>
-    <w:next w:val="BodyText"/>
-    <w:link w:val="Heading8Char"/>
-    <w:uiPriority w:val="9"/>
-    <w:semiHidden/>
-    <w:unhideWhenUsed/>
-    <w:qFormat/>
-    <w:rsid w:val="00A10FD9"/>
-    <w:pPr>
-      <w:keepNext/>
-      <w:keepLines/>
-      <w:spacing w:after="0"/>
-      <w:outlineLvl w:val="7"/>
-    </w:pPr>
+  <w:style w:customStyle="1" w:styleId="Heading8Char" w:type="character">
+    <w:name w:val="Heading 8 Char"/>
+    <w:basedOn w:val="DefaultParagraphFont"/>
+    <w:link w:val="Heading8"/>
+    <w:uiPriority w:val="9"/>
+    <w:semiHidden/>
+    <w:rsid w:val="00A10FD9"/>
     <w:rPr>
       <w:rFonts w:cstheme="majorBidi" w:eastAsiaTheme="majorEastAsia"/>
       <w:i/>
@@ -639,134 +787,6 @@
       <w:color w:themeColor="text1" w:themeTint="D8" w:val="272727"/>
     </w:rPr>
   </w:style>
-  <w:style w:styleId="Heading9" w:type="paragraph">
-    <w:name w:val="heading 9"/>
-    <w:basedOn w:val="Normal"/>
-    <w:next w:val="BodyText"/>
-    <w:link w:val="Heading9Char"/>
-    <w:uiPriority w:val="9"/>
-    <w:semiHidden/>
-    <w:unhideWhenUsed/>
-    <w:qFormat/>
-    <w:rsid w:val="00A10FD9"/>
-    <w:pPr>
-      <w:keepNext/>
-      <w:keepLines/>
-      <w:spacing w:after="0"/>
-      <w:outlineLvl w:val="8"/>
-    </w:pPr>
-    <w:rPr>
-      <w:rFonts w:cstheme="majorBidi" w:eastAsiaTheme="majorEastAsia"/>
-      <w:color w:themeColor="text1" w:themeTint="D8" w:val="272727"/>
-    </w:rPr>
-  </w:style>
-  <w:style w:customStyle="1" w:styleId="Heading1Char" w:type="character">
-    <w:name w:val="Heading 1 Char"/>
-    <w:basedOn w:val="DefaultParagraphFont"/>
-    <w:link w:val="Heading1"/>
-    <w:uiPriority w:val="9"/>
-    <w:rsid w:val="00A10FD9"/>
-    <w:rPr>
-      <w:rFonts w:asciiTheme="majorHAnsi" w:cstheme="majorBidi" w:eastAsiaTheme="majorEastAsia" w:hAnsiTheme="majorHAnsi"/>
-      <w:color w:themeColor="accent1" w:themeShade="BF" w:val="0F4761"/>
-      <w:sz w:val="40"/>
-      <w:szCs w:val="40"/>
-    </w:rPr>
-  </w:style>
-  <w:style w:customStyle="1" w:styleId="Heading2Char" w:type="character">
-    <w:name w:val="Heading 2 Char"/>
-    <w:basedOn w:val="DefaultParagraphFont"/>
-    <w:link w:val="Heading2"/>
-    <w:uiPriority w:val="9"/>
-    <w:semiHidden/>
-    <w:rsid w:val="00A10FD9"/>
-    <w:rPr>
-      <w:rFonts w:asciiTheme="majorHAnsi" w:cstheme="majorBidi" w:eastAsiaTheme="majorEastAsia" w:hAnsiTheme="majorHAnsi"/>
-      <w:color w:themeColor="accent1" w:themeShade="BF" w:val="0F4761"/>
-      <w:sz w:val="32"/>
-      <w:szCs w:val="32"/>
-    </w:rPr>
-  </w:style>
-  <w:style w:customStyle="1" w:styleId="Heading3Char" w:type="character">
-    <w:name w:val="Heading 3 Char"/>
-    <w:basedOn w:val="DefaultParagraphFont"/>
-    <w:link w:val="Heading3"/>
-    <w:uiPriority w:val="9"/>
-    <w:semiHidden/>
-    <w:rsid w:val="00A10FD9"/>
-    <w:rPr>
-      <w:rFonts w:cstheme="majorBidi" w:eastAsiaTheme="majorEastAsia"/>
-      <w:color w:themeColor="accent1" w:themeShade="BF" w:val="0F4761"/>
-      <w:sz w:val="28"/>
-      <w:szCs w:val="28"/>
-    </w:rPr>
-  </w:style>
-  <w:style w:customStyle="1" w:styleId="Heading4Char" w:type="character">
-    <w:name w:val="Heading 4 Char"/>
-    <w:basedOn w:val="DefaultParagraphFont"/>
-    <w:link w:val="Heading4"/>
-    <w:uiPriority w:val="9"/>
-    <w:semiHidden/>
-    <w:rsid w:val="00A10FD9"/>
-    <w:rPr>
-      <w:rFonts w:cstheme="majorBidi" w:eastAsiaTheme="majorEastAsia"/>
-      <w:i/>
-      <w:iCs/>
-      <w:color w:themeColor="accent1" w:themeShade="BF" w:val="0F4761"/>
-    </w:rPr>
-  </w:style>
-  <w:style w:customStyle="1" w:styleId="Heading5Char" w:type="character">
-    <w:name w:val="Heading 5 Char"/>
-    <w:basedOn w:val="DefaultParagraphFont"/>
-    <w:link w:val="Heading5"/>
-    <w:uiPriority w:val="9"/>
-    <w:semiHidden/>
-    <w:rsid w:val="00A10FD9"/>
-    <w:rPr>
-      <w:rFonts w:cstheme="majorBidi" w:eastAsiaTheme="majorEastAsia"/>
-      <w:color w:themeColor="accent1" w:themeShade="BF" w:val="0F4761"/>
-    </w:rPr>
-  </w:style>
-  <w:style w:customStyle="1" w:styleId="Heading6Char" w:type="character">
-    <w:name w:val="Heading 6 Char"/>
-    <w:basedOn w:val="DefaultParagraphFont"/>
-    <w:link w:val="Heading6"/>
-    <w:uiPriority w:val="9"/>
-    <w:semiHidden/>
-    <w:rsid w:val="00A10FD9"/>
-    <w:rPr>
-      <w:rFonts w:cstheme="majorBidi" w:eastAsiaTheme="majorEastAsia"/>
-      <w:i/>
-      <w:iCs/>
-      <w:color w:themeColor="text1" w:themeTint="A6" w:val="595959"/>
-    </w:rPr>
-  </w:style>
-  <w:style w:customStyle="1" w:styleId="Heading7Char" w:type="character">
-    <w:name w:val="Heading 7 Char"/>
-    <w:basedOn w:val="DefaultParagraphFont"/>
-    <w:link w:val="Heading7"/>
-    <w:uiPriority w:val="9"/>
-    <w:semiHidden/>
-    <w:rsid w:val="00A10FD9"/>
-    <w:rPr>
-      <w:rFonts w:cstheme="majorBidi" w:eastAsiaTheme="majorEastAsia"/>
-      <w:color w:themeColor="text1" w:themeTint="A6" w:val="595959"/>
-    </w:rPr>
-  </w:style>
-  <w:style w:customStyle="1" w:styleId="Heading8Char" w:type="character">
-    <w:name w:val="Heading 8 Char"/>
-    <w:basedOn w:val="DefaultParagraphFont"/>
-    <w:link w:val="Heading8"/>
-    <w:uiPriority w:val="9"/>
-    <w:semiHidden/>
-    <w:rsid w:val="00A10FD9"/>
-    <w:rPr>
-      <w:rFonts w:cstheme="majorBidi" w:eastAsiaTheme="majorEastAsia"/>
-      <w:i/>
-      <w:iCs/>
-      <w:color w:themeColor="text1" w:themeTint="D8" w:val="272727"/>
-    </w:rPr>
-  </w:style>
   <w:style w:customStyle="1" w:styleId="Heading9Char" w:type="character">
     <w:name w:val="Heading 9 Char"/>
     <w:basedOn w:val="DefaultParagraphFont"/>
@@ -787,9 +807,14 @@
     <w:unhideWhenUsed/>
     <w:qFormat/>
     <w:pPr>
-      <w:spacing w:after="100" w:before="100"/>
-      <w:ind w:firstLine="0" w:left="480" w:right="480"/>
-    </w:pPr>
+      <w:spacing w:before="0" w:after="276" w:line="276" w:lineRule="auto"/>
+      <w:ind w:firstLine="0"/>
+    </w:pPr>
+    <w:rPr>
+      <w:rFonts w:ascii="Times New Roman" w:hAnsi="Times New Roman" w:cs="Times New Roman" w:eastAsia="Times New Roman"/>
+      <w:sz w:val="24"/>
+      <w:szCs w:val="24"/>
+    </w:rPr>
   </w:style>
   <w:style w:styleId="FootnoteText" w:type="paragraph">
     <w:name w:val="Footnote Text"/>
@@ -939,7 +964,7 @@
       <w:color w:themeColor="accent1" w:themeShade="BF" w:val="365F91"/>
     </w:rPr>
   </w:style>
-  <w:style w:customStyle="1" w:styleId="SourceCode" w:type="paragraph">
+  <w:style w:type="paragraph" w:customStyle="1" w:styleId="SourceCode">
     <w:name w:val="Source Code"/>
     <w:basedOn w:val="Normal"/>
     <w:link w:val="VerbatimChar"/>
@@ -947,7 +972,7 @@
       <w:wordWrap w:val="off"/>
     </w:pPr>
   </w:style>
-  <w:style w:customStyle="1" w:styleId="KeywordTok" w:type="character">
+  <w:style w:type="character" w:customStyle="1" w:styleId="KeywordTok">
     <w:name w:val="KeywordTok"/>
     <w:basedOn w:val="VerbatimChar"/>
     <w:rPr>
@@ -955,77 +980,77 @@
       <w:color w:val="007020"/>
     </w:rPr>
   </w:style>
-  <w:style w:customStyle="1" w:styleId="DataTypeTok" w:type="character">
+  <w:style w:type="character" w:customStyle="1" w:styleId="DataTypeTok">
     <w:name w:val="DataTypeTok"/>
     <w:basedOn w:val="VerbatimChar"/>
     <w:rPr>
       <w:color w:val="902000"/>
     </w:rPr>
   </w:style>
-  <w:style w:customStyle="1" w:styleId="DecValTok" w:type="character">
+  <w:style w:type="character" w:customStyle="1" w:styleId="DecValTok">
     <w:name w:val="DecValTok"/>
     <w:basedOn w:val="VerbatimChar"/>
     <w:rPr>
       <w:color w:val="40a070"/>
     </w:rPr>
   </w:style>
-  <w:style w:customStyle="1" w:styleId="BaseNTok" w:type="character">
+  <w:style w:type="character" w:customStyle="1" w:styleId="BaseNTok">
     <w:name w:val="BaseNTok"/>
     <w:basedOn w:val="VerbatimChar"/>
     <w:rPr>
       <w:color w:val="40a070"/>
     </w:rPr>
   </w:style>
-  <w:style w:customStyle="1" w:styleId="FloatTok" w:type="character">
+  <w:style w:type="character" w:customStyle="1" w:styleId="FloatTok">
     <w:name w:val="FloatTok"/>
     <w:basedOn w:val="VerbatimChar"/>
     <w:rPr>
       <w:color w:val="40a070"/>
     </w:rPr>
   </w:style>
-  <w:style w:customStyle="1" w:styleId="ConstantTok" w:type="character">
+  <w:style w:type="character" w:customStyle="1" w:styleId="ConstantTok">
     <w:name w:val="ConstantTok"/>
     <w:basedOn w:val="VerbatimChar"/>
     <w:rPr>
       <w:color w:val="880000"/>
     </w:rPr>
   </w:style>
-  <w:style w:customStyle="1" w:styleId="CharTok" w:type="character">
+  <w:style w:type="character" w:customStyle="1" w:styleId="CharTok">
     <w:name w:val="CharTok"/>
     <w:basedOn w:val="VerbatimChar"/>
     <w:rPr>
       <w:color w:val="4070a0"/>
     </w:rPr>
   </w:style>
-  <w:style w:customStyle="1" w:styleId="SpecialCharTok" w:type="character">
+  <w:style w:type="character" w:customStyle="1" w:styleId="SpecialCharTok">
     <w:name w:val="SpecialCharTok"/>
     <w:basedOn w:val="VerbatimChar"/>
     <w:rPr>
       <w:color w:val="4070a0"/>
     </w:rPr>
   </w:style>
-  <w:style w:customStyle="1" w:styleId="StringTok" w:type="character">
+  <w:style w:type="character" w:customStyle="1" w:styleId="StringTok">
     <w:name w:val="StringTok"/>
     <w:basedOn w:val="VerbatimChar"/>
     <w:rPr>
       <w:color w:val="4070a0"/>
     </w:rPr>
   </w:style>
-  <w:style w:customStyle="1" w:styleId="VerbatimStringTok" w:type="character">
+  <w:style w:type="character" w:customStyle="1" w:styleId="VerbatimStringTok">
     <w:name w:val="VerbatimStringTok"/>
     <w:basedOn w:val="VerbatimChar"/>
     <w:rPr>
       <w:color w:val="4070a0"/>
     </w:rPr>
   </w:style>
-  <w:style w:customStyle="1" w:styleId="SpecialStringTok" w:type="character">
+  <w:style w:type="character" w:customStyle="1" w:styleId="SpecialStringTok">
     <w:name w:val="SpecialStringTok"/>
     <w:basedOn w:val="VerbatimChar"/>
     <w:rPr>
       <w:color w:val="bb6688"/>
     </w:rPr>
   </w:style>
-  <w:style w:customStyle="1" w:styleId="ImportTok" w:type="character">
+  <w:style w:type="character" w:customStyle="1" w:styleId="ImportTok">
     <w:name w:val="ImportTok"/>
     <w:basedOn w:val="VerbatimChar"/>
     <w:rPr>
@@ -1033,7 +1058,7 @@
       <w:color w:val="008000"/>
     </w:rPr>
   </w:style>
-  <w:style w:customStyle="1" w:styleId="CommentTok" w:type="character">
+  <w:style w:type="character" w:customStyle="1" w:styleId="CommentTok">
     <w:name w:val="CommentTok"/>
     <w:basedOn w:val="VerbatimChar"/>
     <w:rPr>
@@ -1041,7 +1066,7 @@
       <w:color w:val="60a0b0"/>
     </w:rPr>
   </w:style>
-  <w:style w:customStyle="1" w:styleId="DocumentationTok" w:type="character">
+  <w:style w:type="character" w:customStyle="1" w:styleId="DocumentationTok">
     <w:name w:val="DocumentationTok"/>
     <w:basedOn w:val="VerbatimChar"/>
     <w:rPr>
@@ -1049,7 +1074,7 @@
       <w:color w:val="ba2121"/>
     </w:rPr>
   </w:style>
-  <w:style w:customStyle="1" w:styleId="AnnotationTok" w:type="character">
+  <w:style w:type="character" w:customStyle="1" w:styleId="AnnotationTok">
     <w:name w:val="AnnotationTok"/>
     <w:basedOn w:val="VerbatimChar"/>
     <w:rPr>
@@ -1058,7 +1083,7 @@
       <w:color w:val="60a0b0"/>
     </w:rPr>
   </w:style>
-  <w:style w:customStyle="1" w:styleId="CommentVarTok" w:type="character">
+  <w:style w:type="character" w:customStyle="1" w:styleId="CommentVarTok">
     <w:name w:val="CommentVarTok"/>
     <w:basedOn w:val="VerbatimChar"/>
     <w:rPr>
@@ -1067,28 +1092,28 @@
       <w:color w:val="60a0b0"/>
     </w:rPr>
   </w:style>
-  <w:style w:customStyle="1" w:styleId="OtherTok" w:type="character">
+  <w:style w:type="character" w:customStyle="1" w:styleId="OtherTok">
     <w:name w:val="OtherTok"/>
     <w:basedOn w:val="VerbatimChar"/>
     <w:rPr>
       <w:color w:val="007020"/>
     </w:rPr>
   </w:style>
-  <w:style w:customStyle="1" w:styleId="FunctionTok" w:type="character">
+  <w:style w:type="character" w:customStyle="1" w:styleId="FunctionTok">
     <w:name w:val="FunctionTok"/>
     <w:basedOn w:val="VerbatimChar"/>
     <w:rPr>
       <w:color w:val="06287e"/>
     </w:rPr>
   </w:style>
-  <w:style w:customStyle="1" w:styleId="VariableTok" w:type="character">
+  <w:style w:type="character" w:customStyle="1" w:styleId="VariableTok">
     <w:name w:val="VariableTok"/>
     <w:basedOn w:val="VerbatimChar"/>
     <w:rPr>
       <w:color w:val="19177c"/>
     </w:rPr>
   </w:style>
-  <w:style w:customStyle="1" w:styleId="ControlFlowTok" w:type="character">
+  <w:style w:type="character" w:customStyle="1" w:styleId="ControlFlowTok">
     <w:name w:val="ControlFlowTok"/>
     <w:basedOn w:val="VerbatimChar"/>
     <w:rPr>
@@ -1096,45 +1121,45 @@
       <w:color w:val="007020"/>
     </w:rPr>
   </w:style>
-  <w:style w:customStyle="1" w:styleId="OperatorTok" w:type="character">
+  <w:style w:type="character" w:customStyle="1" w:styleId="OperatorTok">
     <w:name w:val="OperatorTok"/>
     <w:basedOn w:val="VerbatimChar"/>
     <w:rPr>
       <w:color w:val="666666"/>
     </w:rPr>
   </w:style>
-  <w:style w:customStyle="1" w:styleId="BuiltInTok" w:type="character">
+  <w:style w:type="character" w:customStyle="1" w:styleId="BuiltInTok">
     <w:name w:val="BuiltInTok"/>
     <w:basedOn w:val="VerbatimChar"/>
     <w:rPr>
       <w:color w:val="008000"/>
     </w:rPr>
   </w:style>
-  <w:style w:customStyle="1" w:styleId="ExtensionTok" w:type="character">
+  <w:style w:type="character" w:customStyle="1" w:styleId="ExtensionTok">
     <w:name w:val="ExtensionTok"/>
     <w:basedOn w:val="VerbatimChar"/>
     <w:rPr/>
   </w:style>
-  <w:style w:customStyle="1" w:styleId="PreprocessorTok" w:type="character">
+  <w:style w:type="character" w:customStyle="1" w:styleId="PreprocessorTok">
     <w:name w:val="PreprocessorTok"/>
     <w:basedOn w:val="VerbatimChar"/>
     <w:rPr>
       <w:color w:val="bc7a00"/>
     </w:rPr>
   </w:style>
-  <w:style w:customStyle="1" w:styleId="AttributeTok" w:type="character">
+  <w:style w:type="character" w:customStyle="1" w:styleId="AttributeTok">
     <w:name w:val="AttributeTok"/>
     <w:basedOn w:val="VerbatimChar"/>
     <w:rPr>
       <w:color w:val="7d9029"/>
     </w:rPr>
   </w:style>
-  <w:style w:customStyle="1" w:styleId="RegionMarkerTok" w:type="character">
+  <w:style w:type="character" w:customStyle="1" w:styleId="RegionMarkerTok">
     <w:name w:val="RegionMarkerTok"/>
     <w:basedOn w:val="VerbatimChar"/>
     <w:rPr/>
   </w:style>
-  <w:style w:customStyle="1" w:styleId="InformationTok" w:type="character">
+  <w:style w:type="character" w:customStyle="1" w:styleId="InformationTok">
     <w:name w:val="InformationTok"/>
     <w:basedOn w:val="VerbatimChar"/>
     <w:rPr>
@@ -1143,7 +1168,7 @@
       <w:color w:val="60a0b0"/>
     </w:rPr>
   </w:style>
-  <w:style w:customStyle="1" w:styleId="WarningTok" w:type="character">
+  <w:style w:type="character" w:customStyle="1" w:styleId="WarningTok">
     <w:name w:val="WarningTok"/>
     <w:basedOn w:val="VerbatimChar"/>
     <w:rPr>
@@ -1152,7 +1177,7 @@
       <w:color w:val="60a0b0"/>
     </w:rPr>
   </w:style>
-  <w:style w:customStyle="1" w:styleId="AlertTok" w:type="character">
+  <w:style w:type="character" w:customStyle="1" w:styleId="AlertTok">
     <w:name w:val="AlertTok"/>
     <w:basedOn w:val="VerbatimChar"/>
     <w:rPr>
@@ -1160,7 +1185,7 @@
       <w:color w:val="ff0000"/>
     </w:rPr>
   </w:style>
-  <w:style w:customStyle="1" w:styleId="ErrorTok" w:type="character">
+  <w:style w:type="character" w:customStyle="1" w:styleId="ErrorTok">
     <w:name w:val="ErrorTok"/>
     <w:basedOn w:val="VerbatimChar"/>
     <w:rPr>
@@ -1168,7 +1193,7 @@
       <w:color w:val="ff0000"/>
     </w:rPr>
   </w:style>
-  <w:style w:customStyle="1" w:styleId="NormalTok" w:type="character">
+  <w:style w:type="character" w:customStyle="1" w:styleId="NormalTok">
     <w:name w:val="NormalTok"/>
     <w:basedOn w:val="VerbatimChar"/>
     <w:rPr/>
@@ -1177,9 +1202,9 @@
 </file>
 
 <file path=word/theme/theme1.xml><?xml version="1.0" encoding="utf-8"?>
-<a:theme xmlns:a="http://schemas.openxmlformats.org/drawingml/2006/main" name="Default Theme">
+<a:theme xmlns:a="http://schemas.openxmlformats.org/drawingml/2006/main" name="Office Theme">
   <a:themeElements>
-    <a:clrScheme name="Default">
+    <a:clrScheme name="Office">
       <a:dk1>
         <a:sysClr val="windowText" lastClr="000000"/>
       </a:dk1>
@@ -1187,49 +1212,143 @@
         <a:sysClr val="window" lastClr="FFFFFF"/>
       </a:lt1>
       <a:dk2>
-        <a:srgbClr val="1F497D"/>
+        <a:srgbClr val="0E2841"/>
       </a:dk2>
       <a:lt2>
-        <a:srgbClr val="EEECE1"/>
+        <a:srgbClr val="E8E8E8"/>
       </a:lt2>
       <a:accent1>
-        <a:srgbClr val="4F81BD"/>
+        <a:srgbClr val="156082"/>
       </a:accent1>
       <a:accent2>
-        <a:srgbClr val="C0504D"/>
+        <a:srgbClr val="E97132"/>
       </a:accent2>
       <a:accent3>
-        <a:srgbClr val="9BBB59"/>
+        <a:srgbClr val="196B24"/>
       </a:accent3>
       <a:accent4>
-        <a:srgbClr val="8064A2"/>
+        <a:srgbClr val="0F9ED5"/>
       </a:accent4>
       <a:accent5>
-        <a:srgbClr val="4BACC6"/>
+        <a:srgbClr val="A02B93"/>
       </a:accent5>
       <a:accent6>
-        <a:srgbClr val="F79646"/>
+        <a:srgbClr val="4EA72E"/>
       </a:accent6>
       <a:hlink>
-        <a:srgbClr val="0000FF"/>
+        <a:srgbClr val="467886"/>
       </a:hlink>
       <a:folHlink>
-        <a:srgbClr val="800080"/>
+        <a:srgbClr val="96607D"/>
       </a:folHlink>
     </a:clrScheme>
-    <a:fontScheme name="Default">
+    <a:fontScheme name="Office">
       <a:majorFont>
-        <a:latin typeface="Times New Roman"/>
+        <a:latin typeface="Aptos Display" panose="02110004020202020204"/>
         <a:ea typeface=""/>
         <a:cs typeface=""/>
+        <a:font script="Jpan" typeface="游ゴシック Light"/>
+        <a:font script="Hang" typeface="맑은 고딕"/>
+        <a:font script="Hans" typeface="等线 Light"/>
+        <a:font script="Hant" typeface="新細明體"/>
+        <a:font script="Arab" typeface="Times New Roman"/>
+        <a:font script="Hebr" typeface="Times New Roman"/>
+        <a:font script="Thai" typeface="Angsana New"/>
+        <a:font script="Ethi" typeface="Nyala"/>
+        <a:font script="Beng" typeface="Vrinda"/>
+        <a:font script="Gujr" typeface="Shruti"/>
+        <a:font script="Khmr" typeface="MoolBoran"/>
+        <a:font script="Knda" typeface="Tunga"/>
+        <a:font script="Guru" typeface="Raavi"/>
+        <a:font script="Cans" typeface="Euphemia"/>
+        <a:font script="Cher" typeface="Plantagenet Cherokee"/>
+        <a:font script="Yiii" typeface="Microsoft Yi Baiti"/>
+        <a:font script="Tibt" typeface="Microsoft Himalaya"/>
+        <a:font script="Thaa" typeface="MV Boli"/>
+        <a:font script="Deva" typeface="Mangal"/>
+        <a:font script="Telu" typeface="Gautami"/>
+        <a:font script="Taml" typeface="Latha"/>
+        <a:font script="Syrc" typeface="Estrangelo Edessa"/>
+        <a:font script="Orya" typeface="Kalinga"/>
+        <a:font script="Mlym" typeface="Kartika"/>
+        <a:font script="Laoo" typeface="DokChampa"/>
+        <a:font script="Sinh" typeface="Iskoola Pota"/>
+        <a:font script="Mong" typeface="Mongolian Baiti"/>
+        <a:font script="Viet" typeface="Times New Roman"/>
+        <a:font script="Uigh" typeface="Microsoft Uighur"/>
+        <a:font script="Geor" typeface="Sylfaen"/>
+        <a:font script="Armn" typeface="Arial"/>
+        <a:font script="Bugi" typeface="Leelawadee UI"/>
+        <a:font script="Bopo" typeface="Microsoft JhengHei"/>
+        <a:font script="Java" typeface="Javanese Text"/>
+        <a:font script="Lisu" typeface="Segoe UI"/>
+        <a:font script="Mymr" typeface="Myanmar Text"/>
+        <a:font script="Nkoo" typeface="Ebrima"/>
+        <a:font script="Olck" typeface="Nirmala UI"/>
+        <a:font script="Osma" typeface="Ebrima"/>
+        <a:font script="Phag" typeface="Phagspa"/>
+        <a:font script="Syrn" typeface="Estrangelo Edessa"/>
+        <a:font script="Syrj" typeface="Estrangelo Edessa"/>
+        <a:font script="Syre" typeface="Estrangelo Edessa"/>
+        <a:font script="Sora" typeface="Nirmala UI"/>
+        <a:font script="Tale" typeface="Microsoft Tai Le"/>
+        <a:font script="Talu" typeface="Microsoft New Tai Lue"/>
+        <a:font script="Tfng" typeface="Ebrima"/>
       </a:majorFont>
       <a:minorFont>
-        <a:latin typeface="Times New Roman"/>
+        <a:latin typeface="Aptos" panose="02110004020202020204"/>
         <a:ea typeface=""/>
         <a:cs typeface=""/>
+        <a:font script="Jpan" typeface="游明朝"/>
+        <a:font script="Hang" typeface="맑은 고딕"/>
+        <a:font script="Hans" typeface="等线"/>
+        <a:font script="Hant" typeface="新細明體"/>
+        <a:font script="Arab" typeface="Arial"/>
+        <a:font script="Hebr" typeface="Arial"/>
+        <a:font script="Thai" typeface="Cordia New"/>
+        <a:font script="Ethi" typeface="Nyala"/>
+        <a:font script="Beng" typeface="Vrinda"/>
+        <a:font script="Gujr" typeface="Shruti"/>
+        <a:font script="Khmr" typeface="DaunPenh"/>
+        <a:font script="Knda" typeface="Tunga"/>
+        <a:font script="Guru" typeface="Raavi"/>
+        <a:font script="Cans" typeface="Euphemia"/>
+        <a:font script="Cher" typeface="Plantagenet Cherokee"/>
+        <a:font script="Yiii" typeface="Microsoft Yi Baiti"/>
+        <a:font script="Tibt" typeface="Microsoft Himalaya"/>
+        <a:font script="Thaa" typeface="MV Boli"/>
+        <a:font script="Deva" typeface="Mangal"/>
+        <a:font script="Telu" typeface="Gautami"/>
+        <a:font script="Taml" typeface="Latha"/>
+        <a:font script="Syrc" typeface="Estrangelo Edessa"/>
+        <a:font script="Orya" typeface="Kalinga"/>
+        <a:font script="Mlym" typeface="Kartika"/>
+        <a:font script="Laoo" typeface="DokChampa"/>
+        <a:font script="Sinh" typeface="Iskoola Pota"/>
+        <a:font script="Mong" typeface="Mongolian Baiti"/>
+        <a:font script="Viet" typeface="Arial"/>
+        <a:font script="Uigh" typeface="Microsoft Uighur"/>
+        <a:font script="Geor" typeface="Sylfaen"/>
+        <a:font script="Armn" typeface="Arial"/>
+        <a:font script="Bugi" typeface="Leelawadee UI"/>
+        <a:font script="Bopo" typeface="Microsoft JhengHei"/>
+        <a:font script="Java" typeface="Javanese Text"/>
+        <a:font script="Lisu" typeface="Segoe UI"/>
+        <a:font script="Mymr" typeface="Myanmar Text"/>
+        <a:font script="Nkoo" typeface="Ebrima"/>
+        <a:font script="Olck" typeface="Nirmala UI"/>
+        <a:font script="Osma" typeface="Ebrima"/>
+        <a:font script="Phag" typeface="Phagspa"/>
+        <a:font script="Syrn" typeface="Estrangelo Edessa"/>
+        <a:font script="Syrj" typeface="Estrangelo Edessa"/>
+        <a:font script="Syre" typeface="Estrangelo Edessa"/>
+        <a:font script="Sora" typeface="Nirmala UI"/>
+        <a:font script="Tale" typeface="Microsoft Tai Le"/>
+        <a:font script="Talu" typeface="Microsoft New Tai Lue"/>
+        <a:font script="Tfng" typeface="Ebrima"/>
       </a:minorFont>
     </a:fontScheme>
-    <a:fmtScheme name="Default">
+    <a:fmtScheme name="Office">
       <a:fillStyleLst>
         <a:solidFill>
           <a:schemeClr val="phClr"/>
@@ -1238,165 +1357,141 @@
           <a:gsLst>
             <a:gs pos="0">
               <a:schemeClr val="phClr">
-                <a:tint val="50000"/>
-                <a:satMod val="300000"/>
+                <a:lumMod val="110000"/>
+                <a:satMod val="105000"/>
+                <a:tint val="67000"/>
               </a:schemeClr>
             </a:gs>
-            <a:gs pos="35000">
+            <a:gs pos="50000">
               <a:schemeClr val="phClr">
-                <a:tint val="37000"/>
-                <a:satMod val="300000"/>
+                <a:lumMod val="105000"/>
+                <a:satMod val="103000"/>
+                <a:tint val="73000"/>
               </a:schemeClr>
             </a:gs>
             <a:gs pos="100000">
               <a:schemeClr val="phClr">
-                <a:tint val="15000"/>
-                <a:satMod val="350000"/>
+                <a:lumMod val="105000"/>
+                <a:satMod val="109000"/>
+                <a:tint val="81000"/>
               </a:schemeClr>
             </a:gs>
           </a:gsLst>
-          <a:lin ang="16200000" scaled="1"/>
+          <a:lin ang="5400000" scaled="0"/>
         </a:gradFill>
         <a:gradFill rotWithShape="1">
           <a:gsLst>
             <a:gs pos="0">
               <a:schemeClr val="phClr">
-                <a:shade val="51000"/>
-                <a:satMod val="130000"/>
+                <a:satMod val="103000"/>
+                <a:lumMod val="102000"/>
+                <a:tint val="94000"/>
               </a:schemeClr>
             </a:gs>
-            <a:gs pos="80000">
+            <a:gs pos="50000">
               <a:schemeClr val="phClr">
-                <a:shade val="93000"/>
-                <a:satMod val="130000"/>
+                <a:satMod val="110000"/>
+                <a:lumMod val="100000"/>
+                <a:shade val="100000"/>
               </a:schemeClr>
             </a:gs>
             <a:gs pos="100000">
               <a:schemeClr val="phClr">
-                <a:shade val="94000"/>
-                <a:satMod val="135000"/>
+                <a:lumMod val="99000"/>
+                <a:satMod val="120000"/>
+                <a:shade val="78000"/>
               </a:schemeClr>
             </a:gs>
           </a:gsLst>
-          <a:lin ang="16200000" scaled="0"/>
+          <a:lin ang="5400000" scaled="0"/>
         </a:gradFill>
       </a:fillStyleLst>
       <a:lnStyleLst>
-        <a:ln w="9525" cap="flat" cmpd="sng" algn="ctr">
-          <a:solidFill>
-            <a:schemeClr val="phClr">
-              <a:shade val="95000"/>
-              <a:satMod val="105000"/>
-            </a:schemeClr>
-          </a:solidFill>
-          <a:prstDash val="solid"/>
-        </a:ln>
-        <a:ln w="25400" cap="flat" cmpd="sng" algn="ctr">
+        <a:ln w="6350" cap="flat" cmpd="sng" algn="ctr">
           <a:solidFill>
             <a:schemeClr val="phClr"/>
           </a:solidFill>
           <a:prstDash val="solid"/>
+          <a:miter lim="800000"/>
         </a:ln>
-        <a:ln w="38100" cap="flat" cmpd="sng" algn="ctr">
+        <a:ln w="12700" cap="flat" cmpd="sng" algn="ctr">
           <a:solidFill>
             <a:schemeClr val="phClr"/>
           </a:solidFill>
           <a:prstDash val="solid"/>
+          <a:miter lim="800000"/>
+        </a:ln>
+        <a:ln w="19050" cap="flat" cmpd="sng" algn="ctr">
+          <a:solidFill>
+            <a:schemeClr val="phClr"/>
+          </a:solidFill>
+          <a:prstDash val="solid"/>
+          <a:miter lim="800000"/>
         </a:ln>
       </a:lnStyleLst>
       <a:effectStyleLst>
         <a:effectStyle>
+          <a:effectLst/>
+        </a:effectStyle>
+        <a:effectStyle>
+          <a:effectLst/>
+        </a:effectStyle>
+        <a:effectStyle>
           <a:effectLst>
-            <a:outerShdw blurRad="40000" dist="20000" dir="5400000" rotWithShape="0">
+            <a:outerShdw blurRad="57150" dist="19050" dir="5400000" algn="ctr" rotWithShape="0">
               <a:srgbClr val="000000">
-                <a:alpha val="38000"/>
+                <a:alpha val="63000"/>
               </a:srgbClr>
             </a:outerShdw>
           </a:effectLst>
-        </a:effectStyle>
-        <a:effectStyle>
-          <a:effectLst>
-            <a:outerShdw blurRad="40000" dist="23000" dir="5400000" rotWithShape="0">
-              <a:srgbClr val="000000">
-                <a:alpha val="35000"/>
-              </a:srgbClr>
-            </a:outerShdw>
-          </a:effectLst>
-        </a:effectStyle>
-        <a:effectStyle>
-          <a:effectLst>
-            <a:outerShdw blurRad="40000" dist="23000" dir="5400000" rotWithShape="0">
-              <a:srgbClr val="000000">
-                <a:alpha val="35000"/>
-              </a:srgbClr>
-            </a:outerShdw>
-          </a:effectLst>
-          <a:scene3d>
-            <a:camera prst="orthographicFront">
-              <a:rot lat="0" lon="0" rev="0"/>
-            </a:camera>
-            <a:lightRig rig="threePt" dir="t">
-              <a:rot lat="0" lon="0" rev="1200000"/>
-            </a:lightRig>
-          </a:scene3d>
-          <a:sp3d>
-            <a:bevelT w="63500" h="25400"/>
-          </a:sp3d>
         </a:effectStyle>
       </a:effectStyleLst>
       <a:bgFillStyleLst>
         <a:solidFill>
           <a:schemeClr val="phClr"/>
         </a:solidFill>
+        <a:solidFill>
+          <a:schemeClr val="phClr">
+            <a:tint val="95000"/>
+            <a:satMod val="170000"/>
+          </a:schemeClr>
+        </a:solidFill>
         <a:gradFill rotWithShape="1">
           <a:gsLst>
             <a:gs pos="0">
               <a:schemeClr val="phClr">
-                <a:tint val="40000"/>
-                <a:satMod val="350000"/>
+                <a:tint val="93000"/>
+                <a:satMod val="150000"/>
+                <a:shade val="98000"/>
+                <a:lumMod val="102000"/>
               </a:schemeClr>
             </a:gs>
-            <a:gs pos="40000">
+            <a:gs pos="50000">
               <a:schemeClr val="phClr">
-                <a:tint val="45000"/>
-                <a:shade val="99000"/>
-                <a:satMod val="350000"/>
+                <a:tint val="98000"/>
+                <a:satMod val="130000"/>
+                <a:shade val="90000"/>
+                <a:lumMod val="103000"/>
               </a:schemeClr>
             </a:gs>
             <a:gs pos="100000">
               <a:schemeClr val="phClr">
-                <a:shade val="20000"/>
-                <a:satMod val="255000"/>
+                <a:shade val="63000"/>
+                <a:satMod val="120000"/>
               </a:schemeClr>
             </a:gs>
           </a:gsLst>
-          <a:path path="circle">
-            <a:fillToRect l="50000" t="-80000" r="50000" b="180000"/>
-          </a:path>
-        </a:gradFill>
-        <a:gradFill rotWithShape="1">
-          <a:gsLst>
-            <a:gs pos="0">
-              <a:schemeClr val="phClr">
-                <a:tint val="80000"/>
-                <a:satMod val="300000"/>
-              </a:schemeClr>
-            </a:gs>
-            <a:gs pos="100000">
-              <a:schemeClr val="phClr">
-                <a:shade val="30000"/>
-                <a:satMod val="200000"/>
-              </a:schemeClr>
-            </a:gs>
-          </a:gsLst>
-          <a:path path="circle">
-            <a:fillToRect l="50000" t="50000" r="50000" b="50000"/>
-          </a:path>
+          <a:lin ang="5400000" scaled="0"/>
         </a:gradFill>
       </a:bgFillStyleLst>
     </a:fmtScheme>
   </a:themeElements>
   <a:objectDefaults/>
   <a:extraClrSchemeLst/>
+  <a:extLst>
+    <a:ext uri="{05A4C25C-085E-4340-85A3-A5531E510DB2}">
+      <thm15:themeFamily xmlns:thm15="http://schemas.microsoft.com/office/thememl/2012/main" name="Office Theme" id="{2E142A2C-CD16-42D6-873A-C26D2A0506FA}" vid="{1BDDFF52-6CD6-40A5-AB3C-68EB2F1E4D0A}"/>
+    </a:ext>
+  </a:extLst>
 </a:theme>
 </file>
</xml_diff>